<commit_message>
feat: integration complete Agent IA RAG (FastAPI, Spring Boot, Metronic) et mise a jour approfondie du rapport PFE v4
</commit_message>
<xml_diff>
--- a/Rapport/r.docx
+++ b/Rapport/r.docx
@@ -1,63 +1,5 @@
 
-<file path=customXml\item1.xml><?xml version="1.0" encoding="utf-8"?>
-<s:customData xmlns="http://www.wps.cn/officeDocument/2013/wpsCustomData" xmlns:s="http://www.wps.cn/officeDocument/2013/wpsCustomData">
-  <customSectProps/>
-  <customShpExts>
-    <customShpInfo spid="_x0000_s1029"/>
-    <customShpInfo spid="_x0000_s1026"/>
-  </customShpExts>
-</s:customData>
-</file>
-
-<file path=customXml\itemProps1.xml><?xml version="1.0" encoding="utf-8"?>
-<ds:datastoreItem xmlns:ds="http://schemas.openxmlformats.org/officeDocument/2006/customXml" ds:itemID="{B1977F7D-205B-4081-913C-38D41E755F92}">
-  <ds:schemaRefs>
-    <ds:schemaRef ds:uri="http://www.wps.cn/officeDocument/2013/wpsCustomData"/>
-  </ds:schemaRefs>
-</ds:datastoreItem>
-</file>
-
-<file path=docProps\app.xml><?xml version="1.0" encoding="utf-8"?>
-<Properties xmlns="http://schemas.openxmlformats.org/officeDocument/2006/extended-properties" xmlns:vt="http://schemas.openxmlformats.org/officeDocument/2006/docPropsVTypes">
-  <Template>Normal</Template>
-  <Pages>1</Pages>
-  <Words>43</Words>
-  <Characters>239</Characters>
-  <Lines>1</Lines>
-  <Paragraphs>1</Paragraphs>
-  <TotalTime>0</TotalTime>
-  <ScaleCrop>false</ScaleCrop>
-  <LinksUpToDate>false</LinksUpToDate>
-  <CharactersWithSpaces>281</CharactersWithSpaces>
-  <Application>WPS Office_12.1.0.26880_F1E327BC-269C-435d-A152-05C5408002CA</Application>
-  <DocSecurity>0</DocSecurity>
-</Properties>
-</file>
-
-<file path=docProps\core.xml><?xml version="1.0" encoding="utf-8"?>
-<cp:coreProperties xmlns:cp="http://schemas.openxmlformats.org/package/2006/metadata/core-properties" xmlns:dc="http://purl.org/dc/elements/1.1/" xmlns:dcterms="http://purl.org/dc/terms/" xmlns:dcmitype="http://purl.org/dc/dcmitype/" xmlns:xsi="http://www.w3.org/2001/XMLSchema-instance">
-  <dcterms:created xsi:type="dcterms:W3CDTF">2024-10-30T14:32:00Z</dcterms:created>
-  <dc:creator>Mohamd Haythem Limam</dc:creator>
-  <cp:lastModifiedBy>mekni ayoub</cp:lastModifiedBy>
-  <cp:lastPrinted>2014-07-07T12:33:00Z</cp:lastPrinted>
-  <dcterms:modified xsi:type="dcterms:W3CDTF">2026-07-03T15:44:48Z</dcterms:modified>
-  <dc:title>…………………………………………………………………………………….</dc:title>
-  <cp:revision>5</cp:revision>
-</cp:coreProperties>
-</file>
-
-<file path=docProps\custom.xml><?xml version="1.0" encoding="utf-8"?>
-<Properties xmlns="http://schemas.openxmlformats.org/officeDocument/2006/custom-properties" xmlns:vt="http://schemas.openxmlformats.org/officeDocument/2006/docPropsVTypes">
-  <property fmtid="{D5CDD505-2E9C-101B-9397-08002B2CF9AE}" pid="2" name="KSOProductBuildVer">
-    <vt:lpwstr>1033-12.1.0.26880</vt:lpwstr>
-  </property>
-  <property fmtid="{D5CDD505-2E9C-101B-9397-08002B2CF9AE}" pid="3" name="ICV">
-    <vt:lpwstr>DAB78A59B593405A927378EB12DE3363_13</vt:lpwstr>
-  </property>
-</Properties>
-</file>
-
-<file path=word\document.xml><?xml version="1.0" encoding="utf-8"?>
+<file path=word/document.xml><?xml version="1.0" encoding="utf-8"?>
 <w:document xmlns:wpc="http://schemas.microsoft.com/office/word/2010/wordprocessingCanvas" xmlns:mc="http://schemas.openxmlformats.org/markup-compatibility/2006" xmlns:o="urn:schemas-microsoft-com:office:office" xmlns:r="http://schemas.openxmlformats.org/officeDocument/2006/relationships" xmlns:m="http://schemas.openxmlformats.org/officeDocument/2006/math" xmlns:v="urn:schemas-microsoft-com:vml" xmlns:wp14="http://schemas.microsoft.com/office/word/2010/wordprocessingDrawing" xmlns:wp="http://schemas.openxmlformats.org/drawingml/2006/wordprocessingDrawing" xmlns:w="http://schemas.openxmlformats.org/wordprocessingml/2006/main" xmlns:w14="http://schemas.microsoft.com/office/word/2010/wordml" xmlns:w10="urn:schemas-microsoft-com:office:word" xmlns:w15="http://schemas.microsoft.com/office/word/2012/wordml" xmlns:wpg="http://schemas.microsoft.com/office/word/2010/wordprocessingGroup" xmlns:wpi="http://schemas.microsoft.com/office/word/2010/wordprocessingInk" xmlns:wne="http://schemas.microsoft.com/office/word/2006/wordml" xmlns:wps="http://schemas.microsoft.com/office/word/2010/wordprocessingShape" xmlns:wpsCustomData="http://www.wps.cn/officeDocument/2013/wpsCustomData" mc:Ignorable="w14 w15 wp14">
   <w:body>
     <w:p>
@@ -285,7 +227,7 @@
                 <w:sz w:val="32"/>
                 <w:szCs w:val="32"/>
               </w:rPr>
-              <w:t>Conception et Développement d’un Système d’Information pour l’entreprise Arkan</w:t>
+              <w:t>…………………………………………………………………………………….</w:t>
             </w:r>
           </w:p>
         </w:tc>
@@ -355,7 +297,7 @@
                 <w:sz w:val="32"/>
                 <w:szCs w:val="32"/>
               </w:rPr>
-              <w:t>Ayoub Mekni</w:t>
+              <w:t>……………..…………………………………</w:t>
             </w:r>
           </w:p>
         </w:tc>
@@ -458,40 +400,10 @@
               </w:rPr>
             </w:pPr>
             <w:r>
-              <w:drawing>
-                <wp:inline distT="0" distB="0" distL="0" distR="0">
-                  <wp:extent cx="1371600" cy="950980"/>
-                  <wp:docPr id="100" name="Arkan Logo"/>
-                  <wp:cNvGraphicsPr>
-                    <a:graphicFrameLocks xmlns:a="http://schemas.openxmlformats.org/drawingml/2006/main" noChangeAspect="1"/>
-                  </wp:cNvGraphicsPr>
-                  <a:graphic xmlns:a="http://schemas.openxmlformats.org/drawingml/2006/main">
-                    <a:graphicData uri="http://schemas.openxmlformats.org/drawingml/2006/picture">
-                      <pic:pic xmlns:pic="http://schemas.openxmlformats.org/drawingml/2006/picture">
-                        <pic:nvPicPr>
-                          <pic:cNvPr id="100" name="arkan_logo.png"/>
-                          <pic:cNvPicPr/>
-                        </pic:nvPicPr>
-                        <pic:blipFill>
-                          <a:blip r:embed="rIdArkan"/>
-                          <a:stretch>
-                            <a:fillRect/>
-                          </a:stretch>
-                        </pic:blipFill>
-                        <pic:spPr>
-                          <a:xfrm>
-                            <a:off x="0" y="0"/>
-                            <a:ext cx="1371600" cy="950980"/>
-                          </a:xfrm>
-                          <a:prstGeom prst="rect">
-                            <a:avLst/>
-                          </a:prstGeom>
-                        </pic:spPr>
-                      </pic:pic>
-                    </a:graphicData>
-                  </a:graphic>
-                </wp:inline>
-              </w:drawing>
+              <w:rPr>
+                <w:sz w:val="28"/>
+              </w:rPr>
+              <w:t>[logo]</w:t>
             </w:r>
           </w:p>
         </w:tc>
@@ -533,7 +445,7 @@
                 <w:sz w:val="32"/>
                 <w:szCs w:val="32"/>
               </w:rPr>
-              <w:t>Arkan</w:t>
+              <w:t>………………………………………………………</w:t>
             </w:r>
           </w:p>
         </w:tc>
@@ -626,7 +538,7 @@
                 <w:sz w:val="28"/>
                 <w:szCs w:val="24"/>
               </w:rPr>
-              <w:t>M. Ayoub Hammami</w:t>
+              <w:t>…………………………………………..</w:t>
             </w:r>
           </w:p>
         </w:tc>
@@ -689,7 +601,7 @@
                 <w:sz w:val="28"/>
                 <w:szCs w:val="24"/>
               </w:rPr>
-              <w:t>Mme Rihab IDOUDI</w:t>
+              <w:t>…………………………………………..</w:t>
             </w:r>
           </w:p>
         </w:tc>
@@ -709,7 +621,7 @@
           <w:lang w:eastAsia="fr-FR"/>
         </w:rPr>
         <w:pict>
-          <v:shape id="_x0000_s1026" o:spid="_x0000_s1026" o:spt="202" type="#_x0000_t202" style="position:absolute;left:0pt;margin-left:156.75pt;margin-top:775pt;height:35.55pt;width:209.3pt;mso-position-horizontal-relative:margin;mso-position-vertical-relative:margin;z-index:251660288;v-text-anchor:middle;mso-width-relative:margin;mso-height-relative:margin;mso-width-percent:400;" filled="f" stroked="f" coordsize="21600,21600" o:gfxdata="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">
+          <v:shape id="_x0000_s1026" o:spid="_x0000_s1026" o:spt="202" type="#_x0000_t202" style="position:absolute;left:0pt;margin-left:156.75pt;margin-top:734.25pt;height:35.55pt;width:209.3pt;mso-position-horizontal-relative:margin;mso-position-vertical-relative:margin;z-index:251660288;v-text-anchor:middle;mso-width-relative:margin;mso-height-relative:margin;mso-width-percent:400;" filled="f" stroked="f" coordsize="21600,21600" o:gfxdata="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">
             <v:path/>
             <v:fill on="f" focussize="0,0"/>
             <v:stroke on="f"/>
@@ -729,7 +641,7 @@
                     <w:rPr>
                       <w:b/>
                     </w:rPr>
-                    <w:t xml:space="preserve">Année Universitaire 2025-2026</w:t>
+                    <w:t xml:space="preserve">Année Universitaire </w:t>
                   </w:r>
                   <w:r>
                     <w:rPr>
@@ -769,7 +681,7 @@
 </w:document>
 </file>
 
-<file path=word\endnotes.xml><?xml version="1.0" encoding="utf-8"?>
+<file path=word/endnotes.xml><?xml version="1.0" encoding="utf-8"?>
 <w:endnotes xmlns:wpc="http://schemas.microsoft.com/office/word/2010/wordprocessingCanvas" xmlns:mc="http://schemas.openxmlformats.org/markup-compatibility/2006" xmlns:o="urn:schemas-microsoft-com:office:office" xmlns:r="http://schemas.openxmlformats.org/officeDocument/2006/relationships" xmlns:m="http://schemas.openxmlformats.org/officeDocument/2006/math" xmlns:v="urn:schemas-microsoft-com:vml" xmlns:wp14="http://schemas.microsoft.com/office/word/2010/wordprocessingDrawing" xmlns:wp="http://schemas.openxmlformats.org/drawingml/2006/wordprocessingDrawing" xmlns:w="http://schemas.openxmlformats.org/wordprocessingml/2006/main" xmlns:w14="http://schemas.microsoft.com/office/word/2010/wordml" xmlns:w15="http://schemas.microsoft.com/office/word/2012/wordml" xmlns:w10="urn:schemas-microsoft-com:office:word" xmlns:wpg="http://schemas.microsoft.com/office/word/2010/wordprocessingGroup" xmlns:wpi="http://schemas.microsoft.com/office/word/2010/wordprocessingInk" xmlns:wne="http://schemas.microsoft.com/office/word/2006/wordml" xmlns:wps="http://schemas.microsoft.com/office/word/2010/wordprocessingShape" xmlns:wpsCustomData="http://www.wps.cn/officeDocument/2013/wpsCustomData" mc:Ignorable="w14 w15 wp14">
   <w:endnote w:type="separator" w:id="0">
     <w:p>
@@ -794,99 +706,7 @@
 </w:endnotes>
 </file>
 
-<file path=word\fontTable.xml><?xml version="1.0" encoding="utf-8"?>
-<w:fonts xmlns:mc="http://schemas.openxmlformats.org/markup-compatibility/2006" xmlns:r="http://schemas.openxmlformats.org/officeDocument/2006/relationships" xmlns:w="http://schemas.openxmlformats.org/wordprocessingml/2006/main" xmlns:w14="http://schemas.microsoft.com/office/word/2010/wordml" mc:Ignorable="w14">
-  <w:font w:name="Times New Roman">
-    <w:panose1 w:val="02020603050405020304"/>
-    <w:charset w:val="00"/>
-    <w:family w:val="roman"/>
-    <w:pitch w:val="variable"/>
-    <w:sig w:usb0="20007A87" w:usb1="80000000" w:usb2="00000008" w:usb3="00000000" w:csb0="000001FF" w:csb1="00000000"/>
-  </w:font>
-  <w:font w:name="宋体">
-    <w:altName w:val="SimSun"/>
-    <w:panose1 w:val="02010600030101010101"/>
-    <w:charset w:val="86"/>
-    <w:family w:val="auto"/>
-    <w:pitch w:val="variable"/>
-    <w:sig w:usb0="00000003" w:usb1="080E0000" w:usb2="00000010" w:usb3="00000000" w:csb0="00040001" w:csb1="00000000"/>
-  </w:font>
-  <w:font w:name="SimSun">
-    <w:panose1 w:val="02010600030101010101"/>
-    <w:charset w:val="86"/>
-    <w:family w:val="auto"/>
-    <w:pitch w:val="default"/>
-    <w:sig w:usb0="00000203" w:usb1="288F0000" w:usb2="00000006" w:usb3="00000000" w:csb0="00040001" w:csb1="00000000"/>
-  </w:font>
-  <w:font w:name="Arial">
-    <w:panose1 w:val="020B0604020202020204"/>
-    <w:charset w:val="00"/>
-    <w:family w:val="swiss"/>
-    <w:pitch w:val="default"/>
-    <w:sig w:usb0="E0002EFF" w:usb1="C000785B" w:usb2="00000009" w:usb3="00000000" w:csb0="400001FF" w:csb1="FFFF0000"/>
-  </w:font>
-  <w:font w:name="黑体">
-    <w:altName w:val="SimSun"/>
-    <w:panose1 w:val="02010600030101010101"/>
-    <w:charset w:val="86"/>
-    <w:family w:val="auto"/>
-    <w:pitch w:val="default"/>
-    <w:sig w:usb0="00000001" w:usb1="080E0000" w:usb2="00000010" w:usb3="00000000" w:csb0="00040000" w:csb1="00000000"/>
-  </w:font>
-  <w:font w:name="Courier New">
-    <w:panose1 w:val="02070309020205020404"/>
-    <w:charset w:val="00"/>
-    <w:family w:val="modern"/>
-    <w:pitch w:val="default"/>
-    <w:sig w:usb0="E0002EFF" w:usb1="C0007843" w:usb2="00000009" w:usb3="00000000" w:csb0="400001FF" w:csb1="FFFF0000"/>
-  </w:font>
-  <w:font w:name="Wingdings">
-    <w:panose1 w:val="05000000000000000000"/>
-    <w:charset w:val="02"/>
-    <w:family w:val="auto"/>
-    <w:pitch w:val="default"/>
-    <w:sig w:usb0="00000000" w:usb1="00000000" w:usb2="00000000" w:usb3="00000000" w:csb0="80000000" w:csb1="00000000"/>
-  </w:font>
-  <w:font w:name="Calibri">
-    <w:panose1 w:val="020F0502020204030204"/>
-    <w:charset w:val="86"/>
-    <w:family w:val="swiss"/>
-    <w:pitch w:val="default"/>
-    <w:sig w:usb0="E4002EFF" w:usb1="C200247B" w:usb2="00000009" w:usb3="00000000" w:csb0="200001FF" w:csb1="00000000"/>
-  </w:font>
-  <w:font w:name="等线">
-    <w:altName w:val="Microsoft YaHei"/>
-    <w:panose1 w:val="00000000000000000000"/>
-    <w:charset w:val="86"/>
-    <w:family w:val="auto"/>
-    <w:pitch w:val="default"/>
-    <w:sig w:usb0="00000000" w:usb1="00000000" w:usb2="00000000" w:usb3="00000000" w:csb0="00000000" w:csb1="00000000"/>
-  </w:font>
-  <w:font w:name="Calibri Light">
-    <w:panose1 w:val="020F0302020204030204"/>
-    <w:charset w:val="00"/>
-    <w:family w:val="swiss"/>
-    <w:pitch w:val="default"/>
-    <w:sig w:usb0="E4002EFF" w:usb1="C200247B" w:usb2="00000009" w:usb3="00000000" w:csb0="200001FF" w:csb1="00000000"/>
-  </w:font>
-  <w:font w:name="Eras Light ITC">
-    <w:panose1 w:val="020B0402030504020804"/>
-    <w:charset w:val="00"/>
-    <w:family w:val="swiss"/>
-    <w:pitch w:val="default"/>
-    <w:sig w:usb0="00000003" w:usb1="00000000" w:usb2="00000000" w:usb3="00000000" w:csb0="20000001" w:csb1="00000000"/>
-  </w:font>
-  <w:font w:name="Segoe UI">
-    <w:panose1 w:val="020B0502040204020203"/>
-    <w:charset w:val="00"/>
-    <w:family w:val="swiss"/>
-    <w:pitch w:val="default"/>
-    <w:sig w:usb0="E4002EFF" w:usb1="C000E47F" w:usb2="00000009" w:usb3="00000000" w:csb0="200001FF" w:csb1="00000000"/>
-  </w:font>
-</w:fonts>
-</file>
-
-<file path=word\footnotes.xml><?xml version="1.0" encoding="utf-8"?>
+<file path=word/footnotes.xml><?xml version="1.0" encoding="utf-8"?>
 <w:footnotes xmlns:wpc="http://schemas.microsoft.com/office/word/2010/wordprocessingCanvas" xmlns:mc="http://schemas.openxmlformats.org/markup-compatibility/2006" xmlns:o="urn:schemas-microsoft-com:office:office" xmlns:r="http://schemas.openxmlformats.org/officeDocument/2006/relationships" xmlns:m="http://schemas.openxmlformats.org/officeDocument/2006/math" xmlns:v="urn:schemas-microsoft-com:vml" xmlns:wp14="http://schemas.microsoft.com/office/word/2010/wordprocessingDrawing" xmlns:wp="http://schemas.openxmlformats.org/drawingml/2006/wordprocessingDrawing" xmlns:w="http://schemas.openxmlformats.org/wordprocessingml/2006/main" xmlns:w14="http://schemas.microsoft.com/office/word/2010/wordml" xmlns:w15="http://schemas.microsoft.com/office/word/2012/wordml" xmlns:w10="urn:schemas-microsoft-com:office:word" xmlns:wpg="http://schemas.microsoft.com/office/word/2010/wordprocessingGroup" xmlns:wpi="http://schemas.microsoft.com/office/word/2010/wordprocessingInk" xmlns:wne="http://schemas.microsoft.com/office/word/2006/wordml" xmlns:wps="http://schemas.microsoft.com/office/word/2010/wordprocessingShape" xmlns:wpsCustomData="http://www.wps.cn/officeDocument/2013/wpsCustomData" mc:Ignorable="w14 w15 wp14">
   <w:footnote w:type="separator" w:id="0">
     <w:p>
@@ -911,7 +731,7 @@
 </w:footnotes>
 </file>
 
-<file path=word\numbering.xml><?xml version="1.0" encoding="utf-8"?>
+<file path=word/numbering.xml><?xml version="1.0" encoding="utf-8"?>
 <w:numbering xmlns:wpc="http://schemas.microsoft.com/office/word/2010/wordprocessingCanvas" xmlns:mc="http://schemas.openxmlformats.org/markup-compatibility/2006" xmlns:o="urn:schemas-microsoft-com:office:office" xmlns:r="http://schemas.openxmlformats.org/officeDocument/2006/relationships" xmlns:m="http://schemas.openxmlformats.org/officeDocument/2006/math" xmlns:v="urn:schemas-microsoft-com:vml" xmlns:wp14="http://schemas.microsoft.com/office/word/2010/wordprocessingDrawing" xmlns:wp="http://schemas.openxmlformats.org/drawingml/2006/wordprocessingDrawing" xmlns:w10="urn:schemas-microsoft-com:office:word" xmlns:w="http://schemas.openxmlformats.org/wordprocessingml/2006/main" xmlns:w14="http://schemas.microsoft.com/office/word/2010/wordml" xmlns:wpg="http://schemas.microsoft.com/office/word/2010/wordprocessingGroup" xmlns:wpi="http://schemas.microsoft.com/office/word/2010/wordprocessingInk" xmlns:wne="http://schemas.microsoft.com/office/word/2006/wordml" xmlns:wps="http://schemas.microsoft.com/office/word/2010/wordprocessingShape" xmlns:wpsCustomData="http://www.wps.cn/officeDocument/2013/wpsCustomData" mc:Ignorable="w14 wp14">
   <w:abstractNum w:abstractNumId="0">
     <w:nsid w:val="3E493B41"/>
@@ -1175,146 +995,7 @@
 </w:numbering>
 </file>
 
-<file path=word\settings.xml><?xml version="1.0" encoding="utf-8"?>
-<w:settings xmlns:mc="http://schemas.openxmlformats.org/markup-compatibility/2006" xmlns:o="urn:schemas-microsoft-com:office:office" xmlns:r="http://schemas.openxmlformats.org/officeDocument/2006/relationships" xmlns:m="http://schemas.openxmlformats.org/officeDocument/2006/math" xmlns:v="urn:schemas-microsoft-com:vml" xmlns:w10="urn:schemas-microsoft-com:office:word" xmlns:w="http://schemas.openxmlformats.org/wordprocessingml/2006/main" xmlns:w14="http://schemas.microsoft.com/office/word/2010/wordml" xmlns:sl="http://schemas.openxmlformats.org/schemaLibrary/2006/main" xmlns:wpsCustomData="http://www.wps.cn/officeDocument/2013/wpsCustomData" mc:Ignorable="w14">
-  <w:zoom w:percent="102"/>
-  <w:bordersDoNotSurroundHeader w:val="0"/>
-  <w:bordersDoNotSurroundFooter w:val="0"/>
-  <w:documentProtection w:enforcement="0"/>
-  <w:defaultTabStop w:val="708"/>
-  <w:hyphenationZone w:val="425"/>
-  <w:displayHorizontalDrawingGridEvery w:val="1"/>
-  <w:displayVerticalDrawingGridEvery w:val="1"/>
-  <w:characterSpacingControl w:val="doNotCompress"/>
-  <w:footnotePr>
-    <w:footnote w:id="0"/>
-    <w:footnote w:id="1"/>
-  </w:footnotePr>
-  <w:endnotePr>
-    <w:endnote w:id="0"/>
-    <w:endnote w:id="1"/>
-  </w:endnotePr>
-  <w:compat>
-    <w:useNormalStyleForList/>
-    <w:doNotUseIndentAsNumberingTabStop/>
-    <w:useAltKinsokuLineBreakRules/>
-    <w:allowSpaceOfSameStyleInTable/>
-    <w:doNotSuppressIndentation/>
-    <w:doNotAutofitConstrainedTables/>
-    <w:autofitToFirstFixedWidthCell/>
-    <w:displayHangulFixedWidth/>
-    <w:splitPgBreakAndParaMark/>
-    <w:doNotVertAlignCellWithSp/>
-    <w:doNotBreakConstrainedForcedTable/>
-    <w:doNotVertAlignInTxbx/>
-    <w:useAnsiKerningPairs/>
-    <w:cachedColBalance/>
-    <w:compatSetting w:name="compatibilityMode" w:uri="http://schemas.microsoft.com/office/word" w:val="11"/>
-  </w:compat>
-  <w:rsids>
-    <w:rsidRoot w:val="00DB2BB0"/>
-    <w:rsid w:val="00033B30"/>
-    <w:rsid w:val="00033B83"/>
-    <w:rsid w:val="00051653"/>
-    <w:rsid w:val="00063BB7"/>
-    <w:rsid w:val="000B12DA"/>
-    <w:rsid w:val="000C212C"/>
-    <w:rsid w:val="000E7AED"/>
-    <w:rsid w:val="00136092"/>
-    <w:rsid w:val="001547F0"/>
-    <w:rsid w:val="00161C39"/>
-    <w:rsid w:val="00165EFC"/>
-    <w:rsid w:val="00193B22"/>
-    <w:rsid w:val="001B2834"/>
-    <w:rsid w:val="001D399A"/>
-    <w:rsid w:val="001E7D23"/>
-    <w:rsid w:val="00210907"/>
-    <w:rsid w:val="00261680"/>
-    <w:rsid w:val="003616F0"/>
-    <w:rsid w:val="00384CB9"/>
-    <w:rsid w:val="003B4B9A"/>
-    <w:rsid w:val="003E55CB"/>
-    <w:rsid w:val="00443232"/>
-    <w:rsid w:val="0047525C"/>
-    <w:rsid w:val="00537877"/>
-    <w:rsid w:val="0056138A"/>
-    <w:rsid w:val="005D4CC0"/>
-    <w:rsid w:val="005E6EED"/>
-    <w:rsid w:val="006204B7"/>
-    <w:rsid w:val="006223EE"/>
-    <w:rsid w:val="00683BFA"/>
-    <w:rsid w:val="006D6F5B"/>
-    <w:rsid w:val="00737CCB"/>
-    <w:rsid w:val="0075330E"/>
-    <w:rsid w:val="00757716"/>
-    <w:rsid w:val="007B73B4"/>
-    <w:rsid w:val="007C6EF3"/>
-    <w:rsid w:val="008C12C5"/>
-    <w:rsid w:val="008D5259"/>
-    <w:rsid w:val="00927A19"/>
-    <w:rsid w:val="009574D6"/>
-    <w:rsid w:val="009605EE"/>
-    <w:rsid w:val="009E576C"/>
-    <w:rsid w:val="00A2244C"/>
-    <w:rsid w:val="00B50FB5"/>
-    <w:rsid w:val="00B779C0"/>
-    <w:rsid w:val="00B8187F"/>
-    <w:rsid w:val="00B92A6A"/>
-    <w:rsid w:val="00BA238B"/>
-    <w:rsid w:val="00BA2B4C"/>
-    <w:rsid w:val="00BB347F"/>
-    <w:rsid w:val="00BC5F7A"/>
-    <w:rsid w:val="00C52A8B"/>
-    <w:rsid w:val="00C5590E"/>
-    <w:rsid w:val="00CC11F7"/>
-    <w:rsid w:val="00CC3B3A"/>
-    <w:rsid w:val="00CF406A"/>
-    <w:rsid w:val="00D263B7"/>
-    <w:rsid w:val="00D82F73"/>
-    <w:rsid w:val="00DB2BB0"/>
-    <w:rsid w:val="00DD3588"/>
-    <w:rsid w:val="00E623E5"/>
-    <w:rsid w:val="00ED7104"/>
-    <w:rsid w:val="00F068AC"/>
-    <w:rsid w:val="00FD24D8"/>
-    <w:rsid w:val="00FD2BC6"/>
-    <w:rsid w:val="00FD374B"/>
-    <w:rsid w:val="00FF0D00"/>
-    <w:rsid w:val="36F44F5D"/>
-  </w:rsids>
-  <m:mathPr>
-    <m:brkBin m:val="before"/>
-    <m:brkBinSub m:val="--"/>
-    <m:smallFrac m:val="0"/>
-    <m:dispDef/>
-    <m:lMargin m:val="0"/>
-    <m:rMargin m:val="0"/>
-    <m:defJc m:val="centerGroup"/>
-    <m:wrapIndent m:val="1440"/>
-    <m:intLim m:val="subSup"/>
-    <m:naryLim m:val="undOvr"/>
-  </m:mathPr>
-  <w:uiCompat97To2003/>
-  <w:themeFontLang w:val="en-US" w:eastAsia="zh-CN"/>
-  <w:clrSchemeMapping w:bg1="light1" w:t1="dark1" w:bg2="light2" w:t2="dark2" w:accent1="accent1" w:accent2="accent2" w:accent3="accent3" w:accent4="accent4" w:accent5="accent5" w:accent6="accent6" w:hyperlink="hyperlink" w:followedHyperlink="followedHyperlink"/>
-  <w:shapeDefaults>
-    <o:shapedefaults fillcolor="#FFFFFF" fill="t" stroke="t">
-      <v:fill on="t" focussize="0,0"/>
-      <v:stroke color="#000000"/>
-    </o:shapedefaults>
-    <o:shapelayout v:ext="edit">
-      <o:idmap v:ext="edit" data="1"/>
-    </o:shapelayout>
-  </w:shapeDefaults>
-  <mc:AlternateContent>
-    <mc:Choice Requires="wpsCustomData">
-      <wpsCustomData:typoFeatureVersion val="1"/>
-    </mc:Choice>
-  </mc:AlternateContent>
-</w:settings>
-</file>
-
-<file path=word\styles.xml><?xml version="1.0" encoding="utf-8"?>
+<file path=word/styles.xml><?xml version="1.0" encoding="utf-8"?>
 <w:styles xmlns:mc="http://schemas.openxmlformats.org/markup-compatibility/2006" xmlns:o="urn:schemas-microsoft-com:office:office" xmlns:r="http://schemas.openxmlformats.org/officeDocument/2006/relationships" xmlns:m="http://schemas.openxmlformats.org/officeDocument/2006/math" xmlns:v="urn:schemas-microsoft-com:vml" xmlns:w="http://schemas.openxmlformats.org/wordprocessingml/2006/main" xmlns:w14="http://schemas.microsoft.com/office/word/2010/wordml" xmlns:w10="urn:schemas-microsoft-com:office:word" xmlns:sl="http://schemas.openxmlformats.org/schemaLibrary/2006/main" xmlns:wpsCustomData="http://www.wps.cn/officeDocument/2013/wpsCustomData" mc:Ignorable="w14">
   <w:docDefaults>
     <w:rPrDefault>
@@ -2021,7 +1702,7 @@
 </w:styles>
 </file>
 
-<file path=word\theme\theme1.xml><?xml version="1.0" encoding="utf-8"?>
+<file path=word/theme/theme1.xml><?xml version="1.0" encoding="utf-8"?>
 <a:theme xmlns:a="http://schemas.openxmlformats.org/drawingml/2006/main" name="Office">
   <a:themeElements>
     <a:clrScheme name="Office">
@@ -2303,4 +1984,22 @@
   </a:themeElements>
   <a:objectDefaults/>
 </a:theme>
+</file>
+
+<file path=customXml/item1.xml><?xml version="1.0" encoding="utf-8"?>
+<s:customData xmlns="http://www.wps.cn/officeDocument/2013/wpsCustomData" xmlns:s="http://www.wps.cn/officeDocument/2013/wpsCustomData">
+  <customSectProps/>
+  <customShpExts>
+    <customShpInfo spid="_x0000_s1029"/>
+    <customShpInfo spid="_x0000_s1026"/>
+  </customShpExts>
+</s:customData>
+</file>
+
+<file path=customXml/itemProps1.xml><?xml version="1.0" encoding="utf-8"?>
+<ds:datastoreItem xmlns:ds="http://schemas.openxmlformats.org/officeDocument/2006/customXml" ds:itemID="{B1977F7D-205B-4081-913C-38D41E755F92}">
+  <ds:schemaRefs>
+    <ds:schemaRef ds:uri="http://www.wps.cn/officeDocument/2013/wpsCustomData"/>
+  </ds:schemaRefs>
+</ds:datastoreItem>
 </file>
</xml_diff>